<commit_message>
Update brochure: remove city tags under What We Do; add full grade range to Grades page
Co-authored-by: yash.shah.uk <yash.shah.uk@gmail.com>
</commit_message>
<xml_diff>
--- a/brochure/Jagetiya_Metals_Brochure.docx
+++ b/brochure/Jagetiya_Metals_Brochure.docx
@@ -909,67 +909,150 @@
           <w:color w:val="0E1A2B"/>
           <w:sz w:val="26"/>
         </w:rPr>
-        <w:t>Sizes &amp; Forms We Keep</w:t>
+        <w:t>Complete Grade Range We Stock</w:t>
       </w:r>
     </w:p>
     <w:p>
       <w:pPr>
-        <w:pStyle w:val="ListBullet"/>
+        <w:spacing w:after="120"/>
+      </w:pPr>
+      <w:r>
+        <w:rPr>
+          <w:sz w:val="21"/>
+        </w:rPr>
+        <w:t>The grades above are just our most-requested alloys — our ready stock spans carbon, alloy, tool, die, bearing, stainless &amp; non-ferrous metals (full details in the Stock List):</w:t>
+      </w:r>
+    </w:p>
+    <w:p>
+      <w:pPr>
         <w:spacing w:after="40"/>
       </w:pPr>
       <w:r>
         <w:rPr>
-          <w:sz w:val="20"/>
+          <w:b/>
+          <w:color w:val="C97A12"/>
+          <w:sz w:val="19"/>
         </w:rPr>
-        <w:t>Round Bars: 16 – 550 mm dia (rolled + forged)</w:t>
+        <w:t xml:space="preserve">Carbon / Mild:  </w:t>
+      </w:r>
+      <w:r>
+        <w:rPr>
+          <w:color w:val="0E1A2B"/>
+          <w:sz w:val="19"/>
+        </w:rPr>
+        <w:t>EN-8 · EN-8D · EN-9 · C-45 · Mild Steel (M.S.)</w:t>
       </w:r>
     </w:p>
     <w:p>
       <w:pPr>
-        <w:pStyle w:val="ListBullet"/>
         <w:spacing w:after="40"/>
       </w:pPr>
       <w:r>
         <w:rPr>
-          <w:sz w:val="20"/>
+          <w:b/>
+          <w:color w:val="C97A12"/>
+          <w:sz w:val="19"/>
         </w:rPr>
-        <w:t>Bright Bars: drawn, precision ground · Forged Bars: large diameters</w:t>
+        <w:t xml:space="preserve">Alloy:  </w:t>
+      </w:r>
+      <w:r>
+        <w:rPr>
+          <w:color w:val="0E1A2B"/>
+          <w:sz w:val="19"/>
+        </w:rPr>
+        <w:t>EN-19 (42CrMo4) · EN-24 · 20MnCr5 · EN-353 · EN-36 · EN-41B · EN-47 · 8620 SAE</w:t>
       </w:r>
     </w:p>
     <w:p>
       <w:pPr>
-        <w:pStyle w:val="ListBullet"/>
         <w:spacing w:after="40"/>
       </w:pPr>
       <w:r>
         <w:rPr>
-          <w:sz w:val="20"/>
+          <w:b/>
+          <w:color w:val="C97A12"/>
+          <w:sz w:val="19"/>
         </w:rPr>
-        <w:t>Square Bars, Flat Bars, RCS &amp; Hex Bars — multiple sections</w:t>
+        <w:t xml:space="preserve">Bearing:  </w:t>
+      </w:r>
+      <w:r>
+        <w:rPr>
+          <w:color w:val="0E1A2B"/>
+          <w:sz w:val="19"/>
+        </w:rPr>
+        <w:t>EN-31 (100Cr6)</w:t>
       </w:r>
     </w:p>
     <w:p>
       <w:pPr>
-        <w:pStyle w:val="ListBullet"/>
         <w:spacing w:after="40"/>
       </w:pPr>
       <w:r>
         <w:rPr>
-          <w:sz w:val="20"/>
+          <w:b/>
+          <w:color w:val="C97A12"/>
+          <w:sz w:val="19"/>
         </w:rPr>
-        <w:t>Billets / Ingots — casting stock · Cut lengths made to order</w:t>
+        <w:t xml:space="preserve">Tool &amp; Die:  </w:t>
+      </w:r>
+      <w:r>
+        <w:rPr>
+          <w:color w:val="0E1A2B"/>
+          <w:sz w:val="19"/>
+        </w:rPr>
+        <w:t>WPS / D3 (1.2080) · H11 (1.2343) · H13 (1.2344)</w:t>
       </w:r>
     </w:p>
     <w:p>
       <w:pPr>
-        <w:pStyle w:val="ListBullet"/>
         <w:spacing w:after="40"/>
       </w:pPr>
       <w:r>
         <w:rPr>
-          <w:sz w:val="20"/>
+          <w:b/>
+          <w:color w:val="C97A12"/>
+          <w:sz w:val="19"/>
         </w:rPr>
-        <w:t>Precision cutting on hydraulic bandsaw: 16 – 550 mm</w:t>
+        <w:t xml:space="preserve">Stainless:  </w:t>
+      </w:r>
+      <w:r>
+        <w:rPr>
+          <w:color w:val="0E1A2B"/>
+          <w:sz w:val="19"/>
+        </w:rPr>
+        <w:t>304 · 304L · 316 · 316L · 321 · 410 · 420 · 430F · 431 · 440C · 17-4-PH</w:t>
+      </w:r>
+    </w:p>
+    <w:p>
+      <w:pPr>
+        <w:spacing w:after="40"/>
+      </w:pPr>
+      <w:r>
+        <w:rPr>
+          <w:b/>
+          <w:color w:val="C97A12"/>
+          <w:sz w:val="19"/>
+        </w:rPr>
+        <w:t xml:space="preserve">Non-Ferrous:  </w:t>
+      </w:r>
+      <w:r>
+        <w:rPr>
+          <w:color w:val="0E1A2B"/>
+          <w:sz w:val="19"/>
+        </w:rPr>
+        <w:t>Brass · Copper (E.C.) · Aluminium (HE30 / 6082)</w:t>
+      </w:r>
+    </w:p>
+    <w:p>
+      <w:pPr>
+        <w:spacing w:after="120"/>
+      </w:pPr>
+      <w:r>
+        <w:rPr>
+          <w:color w:val="5B6B7D"/>
+          <w:sz w:val="18"/>
+        </w:rPr>
+        <w:t>Forms: Round · Bright · Forged · Square · Flat · Hex · RCS   |   Sizes: 4 – 550 mm   |   Cutting: 16 – 550 mm bandsaw</w:t>
       </w:r>
     </w:p>
     <w:p>

</xml_diff>